<commit_message>
Drop 0 configuration inputs workbook in the guided design: Start here index of the register items by due date and fill-in order, self-contained template sheets with guide band and drop-downs, clearly titled reference sheets, reference lists and questions sheet; closure summary text and the list of legacy record statuses mapped to Data Migration
</commit_message>
<xml_diff>
--- a/docs/deliverables/out/Drop-0_Setup_and_Data_Migration/Drop-0_Closure/02_BIBS_Drop-0_Closure_Summary_v2.0.docx
+++ b/docs/deliverables/out/Drop-0_Setup_and_Data_Migration/Drop-0_Closure/02_BIBS_Drop-0_Closure_Summary_v2.0.docx
@@ -6210,7 +6210,7 @@
     <w:p>
       <w:r>
         <w:rPr/>
-        <w:t>The workbook has one register row per configuration input, grouped in twelve areas: organisation; chart of accounts and accounting; banks and bank accounts; document numbering; lists of values; system and security parameters; notifications and documents; products and packages; insurers and partners; users, roles and approvals; module rules and set-up; data migration reference data. Each row has one route:</w:t>
+        <w:t>The workbook opens on a Start here sheet: a few plain steps and the index of every configuration input, one row per item, by due date and, within a due date, with the templates in the order they are filled in (a template whose codes others use comes first). Each row shows its owner, due date, route, the rows entered and the mandatory cells still missing in its template, a status (Not started, In progress, Ready for review, Confirmed, Not applicable) and a link to the sheet. The items cover twelve areas: organisation; chart of accounts and accounting; banks and bank accounts; document numbering; lists of values; system and security parameters; notifications and documents; products and packages; insurers and partners; users, roles and approvals; module rules and set-up; data migration reference data. Each row has one route:</w:t>
       </w:r>
     </w:p>
     <w:p>
@@ -6236,7 +6236,7 @@
       </w:r>
       <w:r>
         <w:rPr/>
-        <w:t>: the owner fills the template sheet named in the row; the rows are entered or uploaded on the named screen and authorised by a second user. The workbook holds the templates CI-01 to CI-10 of BRD-03 and CI-01 to CI-06 of BRD-11, taken from the same sources as their sets, and the fifteen Drop 0 templates D0-01 to D0-15 for the company, branches, holidays, dimensions, employees, chart of accounts, categories and numbering, accounting rules, legacy accounts, tax codes, bank accounts, check books, petty cash, statement layouts and approval limits.</w:t>
+        <w:t>: the owner fills the template sheet named in the row; the rows are entered or uploaded on the named screen and authorised by a second user. Each template sheet is self-contained: what it is for, who provides it, when it is due, how it is loaded and which templates it depends on, then above each column its guide (mandatory or not, format, allowed values, what to enter), one example row to overwrite, and drop-downs with the allowed values and the codes of the templates filled in before. The allowed values are listed on the sheet Reference lists; questions per template and column go to the sheet Questions and comments. The workbook holds the templates CI-01 to CI-10 of BRD-03 and CI-01 to CI-06 of BRD-11, taken from the same sources as their sets, and the fifteen Drop 0 templates D0-01 to D0-15 for the company, branches, holidays, dimensions, employees, chart of accounts, categories and numbering, accounting rules, legacy accounts, tax codes, bank accounts, check books, petty cash, statement layouts and approval limits.</w:t>
       </w:r>
     </w:p>
     <w:p>
@@ -6262,7 +6262,7 @@
       </w:r>
       <w:r>
         <w:rPr/>
-        <w:t>: the owner enters the item directly on the named screen and records the decision in the register.</w:t>
+        <w:t>: the owner enters the item directly on the named screen and records the decision in its row of the Start here index.</w:t>
       </w:r>
     </w:p>
     <w:p>
@@ -6288,7 +6288,7 @@
       </w:r>
       <w:r>
         <w:rPr/>
-        <w:t>: the item is extracted from the legacy systems and loaded by the named object of the Migration Workbook of BRD-13. It is not typed in the configuration workbook; the sheet Migration cross-reference names the object of every such item, so that no item reaches BIBS twice.</w:t>
+        <w:t>: the item is extracted from the legacy systems and loaded by the named object of the Migration Workbook of BRD-13. It is not typed in the configuration workbook; the reference sheet Migration cross-reference names the object of every such item, so that no item reaches BIBS twice.</w:t>
       </w:r>
     </w:p>
     <w:p>
@@ -8217,7 +8217,7 @@
               <w:rPr>
                 <w:sz w:val="17"/>
               </w:rPr>
-              <w:t>133</w:t>
+              <w:t>134</w:t>
             </w:r>
           </w:p>
         </w:tc>

</xml_diff>